<commit_message>
docs: evaluasi empiris terbaru (4 sesi) + temuan backfill, perbarui naskah & figur
- figur hasil fig_hr_* (kelengkapan, timeline, distribusi BPM, kontak, profil loss)
- naskah ID & EN: Tabel 2 per-sesi, Tabel 3 akurasi periode pengukuran, metrik fidelity,
  subbab 3.5 temuan keterbatasan backfill store-and-forward, Gambar 6-9
- catatan 28 Jun + versi bahasa sederhana catatan 26 & 28 Jun
- .gitignore: abaikan CSV ekspor bertanggal (watch-*/phone-*)
</commit_message>
<xml_diff>
--- a/Draft_Manuscript_HR_BLE_EN.docx
+++ b/Draft_Manuscript_HR_BLE_EN.docx
@@ -84,7 +84,7 @@
           <w:i w:val="0"/>
           <w:sz w:val="22"/>
         </w:rPr>
-        <w:t>Continuous heart-rate monitoring using wearable devices is a key component of the Internet of Medical Things (IoMT). A central challenge is guaranteeing data completeness when readings are transferred from a smartwatch to a smartphone over Bluetooth Low Energy (BLE), given the limited packet size (MTU), the best-effort nature of BLE notifications, and operating-system restrictions on background execution. This work designs and implements a two-application system: a smartwatch (Wear OS) application acting as a BLE peripheral/GATT server that records the heart rate every second into a local database and periodically sends it as a batch to a smartphone (Android) application acting as the central. For reliability, each batch is fragmented into opcode-tagged frames (START/DATA/END) with flow control, complemented by a store-and-forward scheme, application-level acknowledgement (ACK), an idempotent (duplicate-free) receiver, and a foreground service for background operation. In a single continuous ~36-minute test on physical devices, the smartwatch recorded 2,167 readings and 2,164 were successfully received by the smartphone (99.86% delivery ratio) with no duplicates; the remainder stayed pending as designed by the store-and-forward scheme. 99.1% of readings were at the highest sensor-accuracy level. One batch of 228 readings (10,717 bytes, 24 frames) was delivered in ~0.32 s at MTU 512. The results show the proposed mechanism is reliable under normal conditions; evaluation across varied conditions is future work.</w:t>
+        <w:t>Continuous heart-rate monitoring using wearable devices is a key component of the Internet of Medical Things (IoMT). A central challenge is guaranteeing data completeness when readings are transferred from a smartwatch to a smartphone over Bluetooth Low Energy (BLE), given the limited packet size (MTU), the best-effort nature of BLE notifications, and operating-system restrictions on background execution. This work designs and implements a two-application system: a smartwatch (Wear OS) application acting as a BLE peripheral/GATT server that records the heart rate every second into a local database and periodically sends it as a batch to a smartphone (Android) application acting as the central. For reliability, each batch is fragmented into opcode-tagged frames (START/DATA/END) with flow control, complemented by a store-and-forward scheme, application-level acknowledgement (ACK), an idempotent (duplicate-free) receiver, and a foreground service for background operation. Evaluation on physical devices spanned four sessions (23,215 measurement readings in total, excluding 22,231 samples recorded while the sensor was not worn). While the BLE link was active, data loss was near zero and every received reading was identical to the smartwatch record (100% value fidelity) with no duplicates. However, a limitation emerged: during smartphone-disconnected periods the backlog was not always backfilled despite being marked as sent, yielding an aggregate delivery ratio of 88.1% across all sessions. 90.8% of readings were at the highest sensor-accuracy level. One batch of 228 readings (10,717 bytes, 24 frames) was delivered in ~0.32 s at MTU 512. The results show the proposed mechanism preserves data integrity and completeness while the link is active; strengthening backlog backfill during disconnection and evaluating varied conditions are future work.</w:t>
       </w:r>
     </w:p>
     <w:p>
@@ -178,7 +178,7 @@
           <w:i w:val="0"/>
           <w:sz w:val="22"/>
         </w:rPr>
-        <w:t>The contributions of this work are: (1) the design and implementation of a two-application Wear OS–Android system for acquiring and delivering heart-rate data; (2) a batch delivery protocol over BLE notifications using opcode-based framing with flow control; (3) reliability mechanisms consisting of store-and-forward, application-level acknowledgement (ACK), and an idempotent (duplicate-free) receiver; (4) background execution via a foreground service; and (5) an initial empirical evaluation of delivery ratio, data quality, and transfer performance, together with supporting data tools for reproducibility.</w:t>
+        <w:t>The contributions of this work are: (1) the design and implementation of a two-application Wear OS–Android system for acquiring and delivering heart-rate data; (2) a batch delivery protocol over BLE notifications using opcode-based framing with flow control; (3) reliability mechanisms consisting of store-and-forward, application-level acknowledgement (ACK), and an idempotent (duplicate-free) receiver; (4) background execution via a foreground service; and (5) an empirical evaluation across four sessions of delivery ratio, value fidelity, data quality, and transfer performance—including the finding of a store-and-forward backfill limitation during disconnection—together with supporting data tools for reproducibility.</w:t>
       </w:r>
     </w:p>
     <w:p>
@@ -622,7 +622,7 @@
           <w:i w:val="0"/>
           <w:sz w:val="22"/>
         </w:rPr>
-        <w:t>Testing was conducted on physical devices because BLE communication cannot be emulated. The device specifications are listed in Table 1. The applications were installed in release mode so that performance measurements are not biased by debug mode. In one run, the smartphone connects to the smartwatch, monitoring is started and left running for several intervals, and the data is then exported to CSV and database formats for analysis.</w:t>
+        <w:t>Testing was conducted on physical devices because BLE communication cannot be emulated. The device specifications are listed in Table 1. The applications were installed in release mode so that performance measurements are not biased by debug mode. Testing was carried out over four sessions during 23–28 June 2026; in each run the smartphone connects to the smartwatch, monitoring is started and left running for several intervals, and the data from both applications is then exported to CSV and database formats for analysis. A total of 23,215 readings were collected during the measurement period (sensor worn).</w:t>
       </w:r>
     </w:p>
     <w:p>
@@ -902,6 +902,28 @@
           </w:p>
         </w:tc>
       </w:tr>
+      <w:tr>
+        <w:tc>
+          <w:tcPr>
+            <w:tcW w:type="dxa" w:w="4320"/>
+          </w:tcPr>
+          <w:p>
+            <w:r>
+              <w:t>Test dataset</w:t>
+            </w:r>
+          </w:p>
+        </w:tc>
+        <w:tc>
+          <w:tcPr>
+            <w:tcW w:type="dxa" w:w="4320"/>
+          </w:tcPr>
+          <w:p>
+            <w:r>
+              <w:t>23–28 Jun 2026; 4 sessions; 23,215 measurement readings</w:t>
+            </w:r>
+          </w:p>
+        </w:tc>
+      </w:tr>
     </w:tbl>
     <w:p>
       <w:pPr>
@@ -934,7 +956,7 @@
           <w:i w:val="0"/>
           <w:sz w:val="22"/>
         </w:rPr>
-        <w:t>The measured metrics are: (1) delivery ratio, i.e., the number of records matched at the smartphone divided by the number of records recorded by the smartwatch, with matching based on the time attribute so it does not depend on clock synchronization between devices; (2) the number of duplicates at the receiver; (3) the sensor-accuracy distribution following the accuracy-status constants of the Android SensorManager (range -1 to 3) [2]; and (4) per-batch transfer latency and throughput recorded automatically by the application instrumentation. Throughput is computed as the payload size divided by the transfer duration.</w:t>
+        <w:t>The measured metrics are: (1) delivery ratio, i.e., the number of records matched at the smartphone divided by the number of records recorded by the smartwatch, with matching based on the time attribute so it does not depend on clock synchronization between devices; (2) value fidelity, i.e., the proportion of received records whose values (bpm and accuracy) are identical to the smartwatch records; (3) the number of duplicates at the receiver; (4) the sensor-accuracy distribution following the accuracy-status constants of the Android SensorManager (range -1 to 3) [2]; and (5) per-batch transfer latency and throughput recorded automatically by the application instrumentation. Throughput is computed as the payload size divided by the transfer duration.</w:t>
       </w:r>
     </w:p>
     <w:p>
@@ -1006,7 +1028,7 @@
           <w:i w:val="0"/>
           <w:sz w:val="22"/>
         </w:rPr>
-        <w:t>In a single continuous ~36-minute session, the results in Table 2 were obtained. The smartwatch recorded 2,167 readings and 2,164 of them were successfully received by the smartphone, yielding a 99.86% delivery ratio with no duplicates. The three readings that did not arrive were not lost but were still pending at the time the data was captured and would be sent in the next interval—confirming that the store-and-forward mechanism works as intended. All received data was identical to the smartwatch records based on time matching, so data integrity was preserved.</w:t>
+        <w:t>The evaluation was carried out over four test sessions, with per-session results in Table 2 and their temporal profiles in Figure 6 and Figure 7. In aggregate, the smartwatch recorded 23,215 readings during the measurement period and 20,455 of them were recorded on the smartphone (88.1% delivery ratio) with no duplicates. However, the loss was not evenly distributed: while the BLE link was active, loss was near zero (e.g., after the smartphone connected in the main session, delivery was practically 100%), whereas all losses were concentrated in periods when the smartphone was disconnected—including one short session whose smartphone never connected, so none of its readings were stored at the receiver. Importantly, every successfully received reading was identical to the smartwatch record based on time matching, both bpm and accuracy values (100% value fidelity), so no data corruption occurred on the BLE channel. The discrepancy between the sent marker on the smartwatch and the presence of records on the smartphone is discussed in Section 3.5.</w:t>
       </w:r>
     </w:p>
     <w:p>
@@ -1020,52 +1042,113 @@
           <w:i w:val="0"/>
           <w:sz w:val="20"/>
         </w:rPr>
-        <w:t>Table 2. Delivery results for one test session.</w:t>
+        <w:t>Table 2. Delivery results per test session.</w:t>
       </w:r>
     </w:p>
     <w:tbl>
       <w:tblPr>
         <w:tblStyle w:val="TableGrid"/>
         <w:tblW w:type="auto" w:w="0"/>
-        <w:jc w:val="center"/>
         <w:tblLook w:firstColumn="1" w:firstRow="1" w:lastColumn="0" w:lastRow="0" w:noHBand="0" w:noVBand="1" w:val="04A0"/>
       </w:tblPr>
       <w:tblGrid>
-        <w:gridCol w:w="4320"/>
-        <w:gridCol w:w="4320"/>
+        <w:gridCol w:w="1234"/>
+        <w:gridCol w:w="1234"/>
+        <w:gridCol w:w="1234"/>
+        <w:gridCol w:w="1234"/>
+        <w:gridCol w:w="1234"/>
+        <w:gridCol w:w="1234"/>
+        <w:gridCol w:w="1234"/>
       </w:tblGrid>
       <w:tr>
         <w:tc>
           <w:tcPr>
-            <w:tcW w:type="dxa" w:w="4320"/>
+            <w:tcW w:type="dxa" w:w="1234"/>
           </w:tcPr>
           <w:p>
-            <w:r/>
             <w:r>
               <w:rPr>
-                <w:rFonts w:ascii="Times New Roman" w:hAnsi="Times New Roman"/>
                 <w:b/>
-                <w:i w:val="0"/>
-                <w:sz w:val="20"/>
               </w:rPr>
-              <w:t>Indicator</w:t>
+              <w:t>Session</w:t>
             </w:r>
           </w:p>
         </w:tc>
         <w:tc>
           <w:tcPr>
-            <w:tcW w:type="dxa" w:w="4320"/>
+            <w:tcW w:type="dxa" w:w="1234"/>
           </w:tcPr>
           <w:p>
-            <w:r/>
             <w:r>
               <w:rPr>
-                <w:rFonts w:ascii="Times New Roman" w:hAnsi="Times New Roman"/>
                 <w:b/>
-                <w:i w:val="0"/>
-                <w:sz w:val="20"/>
               </w:rPr>
-              <w:t>Value</w:t>
+              <w:t>Start (WIB)</w:t>
+            </w:r>
+          </w:p>
+        </w:tc>
+        <w:tc>
+          <w:tcPr>
+            <w:tcW w:type="dxa" w:w="1234"/>
+          </w:tcPr>
+          <w:p>
+            <w:r>
+              <w:rPr>
+                <w:b/>
+              </w:rPr>
+              <w:t>Duration</w:t>
+            </w:r>
+          </w:p>
+        </w:tc>
+        <w:tc>
+          <w:tcPr>
+            <w:tcW w:type="dxa" w:w="1234"/>
+          </w:tcPr>
+          <w:p>
+            <w:r>
+              <w:rPr>
+                <w:b/>
+              </w:rPr>
+              <w:t>Recorded</w:t>
+            </w:r>
+          </w:p>
+        </w:tc>
+        <w:tc>
+          <w:tcPr>
+            <w:tcW w:type="dxa" w:w="1234"/>
+          </w:tcPr>
+          <w:p>
+            <w:r>
+              <w:rPr>
+                <w:b/>
+              </w:rPr>
+              <w:t>Received</w:t>
+            </w:r>
+          </w:p>
+        </w:tc>
+        <w:tc>
+          <w:tcPr>
+            <w:tcW w:type="dxa" w:w="1234"/>
+          </w:tcPr>
+          <w:p>
+            <w:r>
+              <w:rPr>
+                <w:b/>
+              </w:rPr>
+              <w:t>Lost</w:t>
+            </w:r>
+          </w:p>
+        </w:tc>
+        <w:tc>
+          <w:tcPr>
+            <w:tcW w:type="dxa" w:w="1234"/>
+          </w:tcPr>
+          <w:p>
+            <w:r>
+              <w:rPr>
+                <w:b/>
+              </w:rPr>
+              <w:t>Delivery</w:t>
             </w:r>
           </w:p>
         </w:tc>
@@ -1073,35 +1156,71 @@
       <w:tr>
         <w:tc>
           <w:tcPr>
-            <w:tcW w:type="dxa" w:w="4320"/>
+            <w:tcW w:type="dxa" w:w="1234"/>
           </w:tcPr>
           <w:p>
-            <w:r/>
             <w:r>
-              <w:rPr>
-                <w:rFonts w:ascii="Times New Roman" w:hAnsi="Times New Roman"/>
-                <w:b w:val="0"/>
-                <w:i w:val="0"/>
-                <w:sz w:val="20"/>
-              </w:rPr>
-              <w:t>Session duration</w:t>
+              <w:t>Session 1</w:t>
             </w:r>
           </w:p>
         </w:tc>
         <w:tc>
           <w:tcPr>
-            <w:tcW w:type="dxa" w:w="4320"/>
+            <w:tcW w:type="dxa" w:w="1234"/>
           </w:tcPr>
           <w:p>
-            <w:r/>
             <w:r>
-              <w:rPr>
-                <w:rFonts w:ascii="Times New Roman" w:hAnsi="Times New Roman"/>
-                <w:b w:val="0"/>
-                <w:i w:val="0"/>
-                <w:sz w:val="20"/>
-              </w:rPr>
-              <w:t>~36 minutes</w:t>
+              <w:t>23/06 06:38</w:t>
+            </w:r>
+          </w:p>
+        </w:tc>
+        <w:tc>
+          <w:tcPr>
+            <w:tcW w:type="dxa" w:w="1234"/>
+          </w:tcPr>
+          <w:p>
+            <w:r>
+              <w:t>36 min</w:t>
+            </w:r>
+          </w:p>
+        </w:tc>
+        <w:tc>
+          <w:tcPr>
+            <w:tcW w:type="dxa" w:w="1234"/>
+          </w:tcPr>
+          <w:p>
+            <w:r>
+              <w:t>2,177</w:t>
+            </w:r>
+          </w:p>
+        </w:tc>
+        <w:tc>
+          <w:tcPr>
+            <w:tcW w:type="dxa" w:w="1234"/>
+          </w:tcPr>
+          <w:p>
+            <w:r>
+              <w:t>2,164</w:t>
+            </w:r>
+          </w:p>
+        </w:tc>
+        <w:tc>
+          <w:tcPr>
+            <w:tcW w:type="dxa" w:w="1234"/>
+          </w:tcPr>
+          <w:p>
+            <w:r>
+              <w:t>13</w:t>
+            </w:r>
+          </w:p>
+        </w:tc>
+        <w:tc>
+          <w:tcPr>
+            <w:tcW w:type="dxa" w:w="1234"/>
+          </w:tcPr>
+          <w:p>
+            <w:r>
+              <w:t>99.40%</w:t>
             </w:r>
           </w:p>
         </w:tc>
@@ -1109,35 +1228,71 @@
       <w:tr>
         <w:tc>
           <w:tcPr>
-            <w:tcW w:type="dxa" w:w="4320"/>
+            <w:tcW w:type="dxa" w:w="1234"/>
           </w:tcPr>
           <w:p>
-            <w:r/>
             <w:r>
-              <w:rPr>
-                <w:rFonts w:ascii="Times New Roman" w:hAnsi="Times New Roman"/>
-                <w:b w:val="0"/>
-                <w:i w:val="0"/>
-                <w:sz w:val="20"/>
-              </w:rPr>
-              <w:t>Recorded on smartwatch</w:t>
+              <w:t>Session 2</w:t>
             </w:r>
           </w:p>
         </w:tc>
         <w:tc>
           <w:tcPr>
-            <w:tcW w:type="dxa" w:w="4320"/>
+            <w:tcW w:type="dxa" w:w="1234"/>
           </w:tcPr>
           <w:p>
-            <w:r/>
             <w:r>
-              <w:rPr>
-                <w:rFonts w:ascii="Times New Roman" w:hAnsi="Times New Roman"/>
-                <w:b w:val="0"/>
-                <w:i w:val="0"/>
-                <w:sz w:val="20"/>
-              </w:rPr>
-              <w:t>2,167 readings</w:t>
+              <w:t>23/06 08:41</w:t>
+            </w:r>
+          </w:p>
+        </w:tc>
+        <w:tc>
+          <w:tcPr>
+            <w:tcW w:type="dxa" w:w="1234"/>
+          </w:tcPr>
+          <w:p>
+            <w:r>
+              <w:t>1 min</w:t>
+            </w:r>
+          </w:p>
+        </w:tc>
+        <w:tc>
+          <w:tcPr>
+            <w:tcW w:type="dxa" w:w="1234"/>
+          </w:tcPr>
+          <w:p>
+            <w:r>
+              <w:t>53</w:t>
+            </w:r>
+          </w:p>
+        </w:tc>
+        <w:tc>
+          <w:tcPr>
+            <w:tcW w:type="dxa" w:w="1234"/>
+          </w:tcPr>
+          <w:p>
+            <w:r>
+              <w:t>0</w:t>
+            </w:r>
+          </w:p>
+        </w:tc>
+        <w:tc>
+          <w:tcPr>
+            <w:tcW w:type="dxa" w:w="1234"/>
+          </w:tcPr>
+          <w:p>
+            <w:r>
+              <w:t>53</w:t>
+            </w:r>
+          </w:p>
+        </w:tc>
+        <w:tc>
+          <w:tcPr>
+            <w:tcW w:type="dxa" w:w="1234"/>
+          </w:tcPr>
+          <w:p>
+            <w:r>
+              <w:t>0.00%</w:t>
             </w:r>
           </w:p>
         </w:tc>
@@ -1145,35 +1300,71 @@
       <w:tr>
         <w:tc>
           <w:tcPr>
-            <w:tcW w:type="dxa" w:w="4320"/>
+            <w:tcW w:type="dxa" w:w="1234"/>
           </w:tcPr>
           <w:p>
-            <w:r/>
             <w:r>
-              <w:rPr>
-                <w:rFonts w:ascii="Times New Roman" w:hAnsi="Times New Roman"/>
-                <w:b w:val="0"/>
-                <w:i w:val="0"/>
-                <w:sz w:val="20"/>
-              </w:rPr>
-              <w:t>Marked as sent (synced)</w:t>
+              <w:t>Session 3</w:t>
             </w:r>
           </w:p>
         </w:tc>
         <w:tc>
           <w:tcPr>
-            <w:tcW w:type="dxa" w:w="4320"/>
+            <w:tcW w:type="dxa" w:w="1234"/>
           </w:tcPr>
           <w:p>
-            <w:r/>
             <w:r>
-              <w:rPr>
-                <w:rFonts w:ascii="Times New Roman" w:hAnsi="Times New Roman"/>
-                <w:b w:val="0"/>
-                <w:i w:val="0"/>
-                <w:sz w:val="20"/>
-              </w:rPr>
-              <w:t>2,164 readings</w:t>
+              <w:t>23/06 14:15</w:t>
+            </w:r>
+          </w:p>
+        </w:tc>
+        <w:tc>
+          <w:tcPr>
+            <w:tcW w:type="dxa" w:w="1234"/>
+          </w:tcPr>
+          <w:p>
+            <w:r>
+              <w:t>345 min</w:t>
+            </w:r>
+          </w:p>
+        </w:tc>
+        <w:tc>
+          <w:tcPr>
+            <w:tcW w:type="dxa" w:w="1234"/>
+          </w:tcPr>
+          <w:p>
+            <w:r>
+              <w:t>20,702</w:t>
+            </w:r>
+          </w:p>
+        </w:tc>
+        <w:tc>
+          <w:tcPr>
+            <w:tcW w:type="dxa" w:w="1234"/>
+          </w:tcPr>
+          <w:p>
+            <w:r>
+              <w:t>18,013</w:t>
+            </w:r>
+          </w:p>
+        </w:tc>
+        <w:tc>
+          <w:tcPr>
+            <w:tcW w:type="dxa" w:w="1234"/>
+          </w:tcPr>
+          <w:p>
+            <w:r>
+              <w:t>2,689</w:t>
+            </w:r>
+          </w:p>
+        </w:tc>
+        <w:tc>
+          <w:tcPr>
+            <w:tcW w:type="dxa" w:w="1234"/>
+          </w:tcPr>
+          <w:p>
+            <w:r>
+              <w:t>87.01%</w:t>
             </w:r>
           </w:p>
         </w:tc>
@@ -1181,35 +1372,71 @@
       <w:tr>
         <w:tc>
           <w:tcPr>
-            <w:tcW w:type="dxa" w:w="4320"/>
+            <w:tcW w:type="dxa" w:w="1234"/>
           </w:tcPr>
           <w:p>
-            <w:r/>
             <w:r>
-              <w:rPr>
-                <w:rFonts w:ascii="Times New Roman" w:hAnsi="Times New Roman"/>
-                <w:b w:val="0"/>
-                <w:i w:val="0"/>
-                <w:sz w:val="20"/>
-              </w:rPr>
-              <w:t>Received on smartphone</w:t>
+              <w:t>Session 4</w:t>
             </w:r>
           </w:p>
         </w:tc>
         <w:tc>
           <w:tcPr>
-            <w:tcW w:type="dxa" w:w="4320"/>
+            <w:tcW w:type="dxa" w:w="1234"/>
           </w:tcPr>
           <w:p>
-            <w:r/>
             <w:r>
-              <w:rPr>
-                <w:rFonts w:ascii="Times New Roman" w:hAnsi="Times New Roman"/>
-                <w:b w:val="0"/>
-                <w:i w:val="0"/>
-                <w:sz w:val="20"/>
-              </w:rPr>
-              <w:t>2,164 readings</w:t>
+              <w:t>28/06 21:29</w:t>
+            </w:r>
+          </w:p>
+        </w:tc>
+        <w:tc>
+          <w:tcPr>
+            <w:tcW w:type="dxa" w:w="1234"/>
+          </w:tcPr>
+          <w:p>
+            <w:r>
+              <w:t>5 min</w:t>
+            </w:r>
+          </w:p>
+        </w:tc>
+        <w:tc>
+          <w:tcPr>
+            <w:tcW w:type="dxa" w:w="1234"/>
+          </w:tcPr>
+          <w:p>
+            <w:r>
+              <w:t>283</w:t>
+            </w:r>
+          </w:p>
+        </w:tc>
+        <w:tc>
+          <w:tcPr>
+            <w:tcW w:type="dxa" w:w="1234"/>
+          </w:tcPr>
+          <w:p>
+            <w:r>
+              <w:t>278</w:t>
+            </w:r>
+          </w:p>
+        </w:tc>
+        <w:tc>
+          <w:tcPr>
+            <w:tcW w:type="dxa" w:w="1234"/>
+          </w:tcPr>
+          <w:p>
+            <w:r>
+              <w:t>5</w:t>
+            </w:r>
+          </w:p>
+        </w:tc>
+        <w:tc>
+          <w:tcPr>
+            <w:tcW w:type="dxa" w:w="1234"/>
+          </w:tcPr>
+          <w:p>
+            <w:r>
+              <w:t>98.23%</w:t>
             </w:r>
           </w:p>
         </w:tc>
@@ -1217,71 +1444,92 @@
       <w:tr>
         <w:tc>
           <w:tcPr>
-            <w:tcW w:type="dxa" w:w="4320"/>
+            <w:tcW w:type="dxa" w:w="1234"/>
           </w:tcPr>
           <w:p>
-            <w:r/>
             <w:r>
               <w:rPr>
-                <w:rFonts w:ascii="Times New Roman" w:hAnsi="Times New Roman"/>
-                <w:b w:val="0"/>
-                <w:i w:val="0"/>
-                <w:sz w:val="20"/>
+                <w:b/>
               </w:rPr>
-              <w:t>Duplicates on smartphone</w:t>
+              <w:t>Total</w:t>
             </w:r>
           </w:p>
         </w:tc>
         <w:tc>
           <w:tcPr>
-            <w:tcW w:type="dxa" w:w="4320"/>
+            <w:tcW w:type="dxa" w:w="1234"/>
           </w:tcPr>
           <w:p>
-            <w:r/>
             <w:r>
               <w:rPr>
-                <w:rFonts w:ascii="Times New Roman" w:hAnsi="Times New Roman"/>
-                <w:b w:val="0"/>
-                <w:i w:val="0"/>
-                <w:sz w:val="20"/>
+                <w:b/>
               </w:rPr>
-              <w:t>0</w:t>
-            </w:r>
-          </w:p>
-        </w:tc>
-      </w:tr>
-      <w:tr>
-        <w:tc>
-          <w:tcPr>
-            <w:tcW w:type="dxa" w:w="4320"/>
-          </w:tcPr>
-          <w:p>
-            <w:r/>
-            <w:r>
-              <w:rPr>
-                <w:rFonts w:ascii="Times New Roman" w:hAnsi="Times New Roman"/>
-                <w:b w:val="0"/>
-                <w:i w:val="0"/>
-                <w:sz w:val="20"/>
-              </w:rPr>
-              <w:t>Delivery ratio</w:t>
+              <w:t>—</w:t>
             </w:r>
           </w:p>
         </w:tc>
         <w:tc>
           <w:tcPr>
-            <w:tcW w:type="dxa" w:w="4320"/>
+            <w:tcW w:type="dxa" w:w="1234"/>
           </w:tcPr>
           <w:p>
-            <w:r/>
             <w:r>
               <w:rPr>
-                <w:rFonts w:ascii="Times New Roman" w:hAnsi="Times New Roman"/>
-                <w:b w:val="0"/>
-                <w:i w:val="0"/>
-                <w:sz w:val="20"/>
+                <w:b/>
               </w:rPr>
-              <w:t>99.86%</w:t>
+              <w:t>387 min</w:t>
+            </w:r>
+          </w:p>
+        </w:tc>
+        <w:tc>
+          <w:tcPr>
+            <w:tcW w:type="dxa" w:w="1234"/>
+          </w:tcPr>
+          <w:p>
+            <w:r>
+              <w:rPr>
+                <w:b/>
+              </w:rPr>
+              <w:t>23,215</w:t>
+            </w:r>
+          </w:p>
+        </w:tc>
+        <w:tc>
+          <w:tcPr>
+            <w:tcW w:type="dxa" w:w="1234"/>
+          </w:tcPr>
+          <w:p>
+            <w:r>
+              <w:rPr>
+                <w:b/>
+              </w:rPr>
+              <w:t>20,455</w:t>
+            </w:r>
+          </w:p>
+        </w:tc>
+        <w:tc>
+          <w:tcPr>
+            <w:tcW w:type="dxa" w:w="1234"/>
+          </w:tcPr>
+          <w:p>
+            <w:r>
+              <w:rPr>
+                <w:b/>
+              </w:rPr>
+              <w:t>2,760</w:t>
+            </w:r>
+          </w:p>
+        </w:tc>
+        <w:tc>
+          <w:tcPr>
+            <w:tcW w:type="dxa" w:w="1234"/>
+          </w:tcPr>
+          <w:p>
+            <w:r>
+              <w:rPr>
+                <w:b/>
+              </w:rPr>
+              <w:t>88.11%</w:t>
             </w:r>
           </w:p>
         </w:tc>
@@ -1291,6 +1539,106 @@
       <w:pPr>
         <w:spacing w:after="40"/>
       </w:pPr>
+    </w:p>
+    <w:p>
+      <w:pPr>
+        <w:jc w:val="center"/>
+      </w:pPr>
+      <w:r>
+        <w:drawing>
+          <wp:inline xmlns:a="http://schemas.openxmlformats.org/drawingml/2006/main" xmlns:pic="http://schemas.openxmlformats.org/drawingml/2006/picture">
+            <wp:extent cx="5120640" cy="2343955"/>
+            <wp:docPr id="6" name="Picture 6"/>
+            <wp:cNvGraphicFramePr>
+              <a:graphicFrameLocks noChangeAspect="1"/>
+            </wp:cNvGraphicFramePr>
+            <a:graphic>
+              <a:graphicData uri="http://schemas.openxmlformats.org/drawingml/2006/picture">
+                <pic:pic>
+                  <pic:nvPicPr>
+                    <pic:cNvPr id="0" name="fig_hr_completeness.png"/>
+                    <pic:cNvPicPr/>
+                  </pic:nvPicPr>
+                  <pic:blipFill>
+                    <a:blip r:embed="rId14"/>
+                    <a:stretch>
+                      <a:fillRect/>
+                    </a:stretch>
+                  </pic:blipFill>
+                  <pic:spPr>
+                    <a:xfrm>
+                      <a:off x="0" y="0"/>
+                      <a:ext cx="5120640" cy="2343955"/>
+                    </a:xfrm>
+                    <a:prstGeom prst="rect"/>
+                  </pic:spPr>
+                </pic:pic>
+              </a:graphicData>
+            </a:graphic>
+          </wp:inline>
+        </w:drawing>
+      </w:r>
+    </w:p>
+    <w:p>
+      <w:pPr>
+        <w:jc w:val="center"/>
+      </w:pPr>
+      <w:r>
+        <w:rPr>
+          <w:sz w:val="20"/>
+        </w:rPr>
+        <w:t>Figure 6. Data completeness per test session (received vs lost).</w:t>
+      </w:r>
+    </w:p>
+    <w:p>
+      <w:pPr>
+        <w:jc w:val="center"/>
+      </w:pPr>
+      <w:r>
+        <w:drawing>
+          <wp:inline xmlns:a="http://schemas.openxmlformats.org/drawingml/2006/main" xmlns:pic="http://schemas.openxmlformats.org/drawingml/2006/picture">
+            <wp:extent cx="5760720" cy="2936523"/>
+            <wp:docPr id="7" name="Picture 7"/>
+            <wp:cNvGraphicFramePr>
+              <a:graphicFrameLocks noChangeAspect="1"/>
+            </wp:cNvGraphicFramePr>
+            <a:graphic>
+              <a:graphicData uri="http://schemas.openxmlformats.org/drawingml/2006/picture">
+                <pic:pic>
+                  <pic:nvPicPr>
+                    <pic:cNvPr id="0" name="fig_hr_timeline.png"/>
+                    <pic:cNvPicPr/>
+                  </pic:nvPicPr>
+                  <pic:blipFill>
+                    <a:blip r:embed="rId15"/>
+                    <a:stretch>
+                      <a:fillRect/>
+                    </a:stretch>
+                  </pic:blipFill>
+                  <pic:spPr>
+                    <a:xfrm>
+                      <a:off x="0" y="0"/>
+                      <a:ext cx="5760720" cy="2936523"/>
+                    </a:xfrm>
+                    <a:prstGeom prst="rect"/>
+                  </pic:spPr>
+                </pic:pic>
+              </a:graphicData>
+            </a:graphic>
+          </wp:inline>
+        </w:drawing>
+      </w:r>
+    </w:p>
+    <w:p>
+      <w:pPr>
+        <w:jc w:val="center"/>
+      </w:pPr>
+      <w:r>
+        <w:rPr>
+          <w:sz w:val="20"/>
+        </w:rPr>
+        <w:t>Figure 7. Heart-rate signal and BLE packet loss in the main session.</w:t>
+      </w:r>
     </w:p>
     <w:p>
       <w:pPr>
@@ -1318,7 +1666,7 @@
           <w:i w:val="0"/>
           <w:sz w:val="22"/>
         </w:rPr>
-        <w:t>The sensor-accuracy distribution is shown in Table 3. 99.1% of readings were at the highest accuracy (value 3), and only 0.9% (20 readings) were at the no-contact condition (value -1), which commonly occurs when the sensor momentarily loses skin contact [2]. No readings were at low accuracy (0–2). The heart-rate statistics for the session were: minimum 71 bpm, maximum 96 bpm, mean 80.4 bpm, and standard deviation 5.2 bpm. The distribution being strongly dominated by the highest accuracy indicates good data quality.</w:t>
+        <w:t>The sensor-accuracy distribution during the measurement period is shown in Table 3 and Figure 9. 90.8% of readings were at the highest accuracy (value 3), 9.1% (2,113 readings) at the no-contact condition (value -1)—which commonly occurs when the sensor momentarily loses skin contact [2]—and 0.1% (15 readings) at value 0. The heart-rate statistics for the highest-accuracy readings (n=21,087, Figure 8) were: minimum 60 bpm, maximum 123 bpm, mean 83.4 bpm, and standard deviation 9.9 bpm. Note that 22,231 samples in the tail of the recording—with frozen (constant) values and accuracy ≤0 because the smartwatch was not worn—were excluded from the statistics above to avoid biasing the results.</w:t>
       </w:r>
     </w:p>
     <w:p>
@@ -1332,7 +1680,7 @@
           <w:i w:val="0"/>
           <w:sz w:val="20"/>
         </w:rPr>
-        <w:t>Table 3. Distribution of sensor-accuracy values.</w:t>
+        <w:t>Table 3. Distribution of sensor-accuracy values (measurement period).</w:t>
       </w:r>
     </w:p>
     <w:tbl>
@@ -1353,13 +1701,9 @@
             <w:tcW w:type="dxa" w:w="2880"/>
           </w:tcPr>
           <w:p>
-            <w:r/>
             <w:r>
               <w:rPr>
-                <w:rFonts w:ascii="Times New Roman" w:hAnsi="Times New Roman"/>
                 <w:b/>
-                <w:i w:val="0"/>
-                <w:sz w:val="20"/>
               </w:rPr>
               <w:t>Sensor accuracy</w:t>
             </w:r>
@@ -1370,13 +1714,9 @@
             <w:tcW w:type="dxa" w:w="2880"/>
           </w:tcPr>
           <w:p>
-            <w:r/>
             <w:r>
               <w:rPr>
-                <w:rFonts w:ascii="Times New Roman" w:hAnsi="Times New Roman"/>
                 <w:b/>
-                <w:i w:val="0"/>
-                <w:sz w:val="20"/>
               </w:rPr>
               <w:t>Count</w:t>
             </w:r>
@@ -1387,13 +1727,9 @@
             <w:tcW w:type="dxa" w:w="2880"/>
           </w:tcPr>
           <w:p>
-            <w:r/>
             <w:r>
               <w:rPr>
-                <w:rFonts w:ascii="Times New Roman" w:hAnsi="Times New Roman"/>
                 <w:b/>
-                <w:i w:val="0"/>
-                <w:sz w:val="20"/>
               </w:rPr>
               <w:t>Percentage</w:t>
             </w:r>
@@ -1406,14 +1742,7 @@
             <w:tcW w:type="dxa" w:w="2880"/>
           </w:tcPr>
           <w:p>
-            <w:r/>
             <w:r>
-              <w:rPr>
-                <w:rFonts w:ascii="Times New Roman" w:hAnsi="Times New Roman"/>
-                <w:b w:val="0"/>
-                <w:i w:val="0"/>
-                <w:sz w:val="20"/>
-              </w:rPr>
               <w:t>3 (high)</w:t>
             </w:r>
           </w:p>
@@ -1423,15 +1752,8 @@
             <w:tcW w:type="dxa" w:w="2880"/>
           </w:tcPr>
           <w:p>
-            <w:r/>
             <w:r>
-              <w:rPr>
-                <w:rFonts w:ascii="Times New Roman" w:hAnsi="Times New Roman"/>
-                <w:b w:val="0"/>
-                <w:i w:val="0"/>
-                <w:sz w:val="20"/>
-              </w:rPr>
-              <w:t>2,147</w:t>
+              <w:t>21,087</w:t>
             </w:r>
           </w:p>
         </w:tc>
@@ -1440,15 +1762,8 @@
             <w:tcW w:type="dxa" w:w="2880"/>
           </w:tcPr>
           <w:p>
-            <w:r/>
             <w:r>
-              <w:rPr>
-                <w:rFonts w:ascii="Times New Roman" w:hAnsi="Times New Roman"/>
-                <w:b w:val="0"/>
-                <w:i w:val="0"/>
-                <w:sz w:val="20"/>
-              </w:rPr>
-              <w:t>99.1%</w:t>
+              <w:t>90.8%</w:t>
             </w:r>
           </w:p>
         </w:tc>
@@ -1459,15 +1774,8 @@
             <w:tcW w:type="dxa" w:w="2880"/>
           </w:tcPr>
           <w:p>
-            <w:r/>
             <w:r>
-              <w:rPr>
-                <w:rFonts w:ascii="Times New Roman" w:hAnsi="Times New Roman"/>
-                <w:b w:val="0"/>
-                <w:i w:val="0"/>
-                <w:sz w:val="20"/>
-              </w:rPr>
-              <w:t>-1 (no contact)</w:t>
+              <w:t>0 (medium)</w:t>
             </w:r>
           </w:p>
         </w:tc>
@@ -1476,15 +1784,8 @@
             <w:tcW w:type="dxa" w:w="2880"/>
           </w:tcPr>
           <w:p>
-            <w:r/>
             <w:r>
-              <w:rPr>
-                <w:rFonts w:ascii="Times New Roman" w:hAnsi="Times New Roman"/>
-                <w:b w:val="0"/>
-                <w:i w:val="0"/>
-                <w:sz w:val="20"/>
-              </w:rPr>
-              <w:t>20</w:t>
+              <w:t>15</w:t>
             </w:r>
           </w:p>
         </w:tc>
@@ -1493,15 +1794,8 @@
             <w:tcW w:type="dxa" w:w="2880"/>
           </w:tcPr>
           <w:p>
-            <w:r/>
             <w:r>
-              <w:rPr>
-                <w:rFonts w:ascii="Times New Roman" w:hAnsi="Times New Roman"/>
-                <w:b w:val="0"/>
-                <w:i w:val="0"/>
-                <w:sz w:val="20"/>
-              </w:rPr>
-              <w:t>0.9%</w:t>
+              <w:t>0.1%</w:t>
             </w:r>
           </w:p>
         </w:tc>
@@ -1512,14 +1806,39 @@
             <w:tcW w:type="dxa" w:w="2880"/>
           </w:tcPr>
           <w:p>
-            <w:r/>
             <w:r>
-              <w:rPr>
-                <w:rFonts w:ascii="Times New Roman" w:hAnsi="Times New Roman"/>
-                <w:b w:val="0"/>
-                <w:i w:val="0"/>
-                <w:sz w:val="20"/>
-              </w:rPr>
+              <w:t>-1 (no contact)</w:t>
+            </w:r>
+          </w:p>
+        </w:tc>
+        <w:tc>
+          <w:tcPr>
+            <w:tcW w:type="dxa" w:w="2880"/>
+          </w:tcPr>
+          <w:p>
+            <w:r>
+              <w:t>2,113</w:t>
+            </w:r>
+          </w:p>
+        </w:tc>
+        <w:tc>
+          <w:tcPr>
+            <w:tcW w:type="dxa" w:w="2880"/>
+          </w:tcPr>
+          <w:p>
+            <w:r>
+              <w:t>9.1%</w:t>
+            </w:r>
+          </w:p>
+        </w:tc>
+      </w:tr>
+      <w:tr>
+        <w:tc>
+          <w:tcPr>
+            <w:tcW w:type="dxa" w:w="2880"/>
+          </w:tcPr>
+          <w:p>
+            <w:r>
               <w:t>Total</w:t>
             </w:r>
           </w:p>
@@ -1529,15 +1848,8 @@
             <w:tcW w:type="dxa" w:w="2880"/>
           </w:tcPr>
           <w:p>
-            <w:r/>
             <w:r>
-              <w:rPr>
-                <w:rFonts w:ascii="Times New Roman" w:hAnsi="Times New Roman"/>
-                <w:b w:val="0"/>
-                <w:i w:val="0"/>
-                <w:sz w:val="20"/>
-              </w:rPr>
-              <w:t>2,167</w:t>
+              <w:t>23,215</w:t>
             </w:r>
           </w:p>
         </w:tc>
@@ -1546,14 +1858,7 @@
             <w:tcW w:type="dxa" w:w="2880"/>
           </w:tcPr>
           <w:p>
-            <w:r/>
             <w:r>
-              <w:rPr>
-                <w:rFonts w:ascii="Times New Roman" w:hAnsi="Times New Roman"/>
-                <w:b w:val="0"/>
-                <w:i w:val="0"/>
-                <w:sz w:val="20"/>
-              </w:rPr>
               <w:t>100%</w:t>
             </w:r>
           </w:p>
@@ -1564,6 +1869,106 @@
       <w:pPr>
         <w:spacing w:after="40"/>
       </w:pPr>
+    </w:p>
+    <w:p>
+      <w:pPr>
+        <w:jc w:val="center"/>
+      </w:pPr>
+      <w:r>
+        <w:drawing>
+          <wp:inline xmlns:a="http://schemas.openxmlformats.org/drawingml/2006/main" xmlns:pic="http://schemas.openxmlformats.org/drawingml/2006/picture">
+            <wp:extent cx="4297680" cy="2840726"/>
+            <wp:docPr id="8" name="Picture 8"/>
+            <wp:cNvGraphicFramePr>
+              <a:graphicFrameLocks noChangeAspect="1"/>
+            </wp:cNvGraphicFramePr>
+            <a:graphic>
+              <a:graphicData uri="http://schemas.openxmlformats.org/drawingml/2006/picture">
+                <pic:pic>
+                  <pic:nvPicPr>
+                    <pic:cNvPr id="0" name="fig_hr_bpm_dist.png"/>
+                    <pic:cNvPicPr/>
+                  </pic:nvPicPr>
+                  <pic:blipFill>
+                    <a:blip r:embed="rId16"/>
+                    <a:stretch>
+                      <a:fillRect/>
+                    </a:stretch>
+                  </pic:blipFill>
+                  <pic:spPr>
+                    <a:xfrm>
+                      <a:off x="0" y="0"/>
+                      <a:ext cx="4297680" cy="2840726"/>
+                    </a:xfrm>
+                    <a:prstGeom prst="rect"/>
+                  </pic:spPr>
+                </pic:pic>
+              </a:graphicData>
+            </a:graphic>
+          </wp:inline>
+        </w:drawing>
+      </w:r>
+    </w:p>
+    <w:p>
+      <w:pPr>
+        <w:jc w:val="center"/>
+      </w:pPr>
+      <w:r>
+        <w:rPr>
+          <w:sz w:val="20"/>
+        </w:rPr>
+        <w:t>Figure 8. Distribution of heart-rate values for the highest-accuracy readings.</w:t>
+      </w:r>
+    </w:p>
+    <w:p>
+      <w:pPr>
+        <w:jc w:val="center"/>
+      </w:pPr>
+      <w:r>
+        <w:drawing>
+          <wp:inline xmlns:a="http://schemas.openxmlformats.org/drawingml/2006/main" xmlns:pic="http://schemas.openxmlformats.org/drawingml/2006/picture">
+            <wp:extent cx="4572000" cy="2942410"/>
+            <wp:docPr id="9" name="Picture 9"/>
+            <wp:cNvGraphicFramePr>
+              <a:graphicFrameLocks noChangeAspect="1"/>
+            </wp:cNvGraphicFramePr>
+            <a:graphic>
+              <a:graphicData uri="http://schemas.openxmlformats.org/drawingml/2006/picture">
+                <pic:pic>
+                  <pic:nvPicPr>
+                    <pic:cNvPr id="0" name="fig_hr_contact.png"/>
+                    <pic:cNvPicPr/>
+                  </pic:nvPicPr>
+                  <pic:blipFill>
+                    <a:blip r:embed="rId17"/>
+                    <a:stretch>
+                      <a:fillRect/>
+                    </a:stretch>
+                  </pic:blipFill>
+                  <pic:spPr>
+                    <a:xfrm>
+                      <a:off x="0" y="0"/>
+                      <a:ext cx="4572000" cy="2942410"/>
+                    </a:xfrm>
+                    <a:prstGeom prst="rect"/>
+                  </pic:spPr>
+                </pic:pic>
+              </a:graphicData>
+            </a:graphic>
+          </wp:inline>
+        </w:drawing>
+      </w:r>
+    </w:p>
+    <w:p>
+      <w:pPr>
+        <w:jc w:val="center"/>
+      </w:pPr>
+      <w:r>
+        <w:rPr>
+          <w:sz w:val="20"/>
+        </w:rPr>
+        <w:t>Figure 9. Sensor contact-quality distribution during the measurement period.</w:t>
+      </w:r>
     </w:p>
     <w:p>
       <w:pPr>
@@ -1595,6 +2000,20 @@
       </w:r>
     </w:p>
     <w:p>
+      <w:r>
+        <w:rPr>
+          <w:b/>
+          <w:sz w:val="22"/>
+        </w:rPr>
+        <w:t>3.5 Finding: Store-and-Forward Backfill Limitation</w:t>
+      </w:r>
+    </w:p>
+    <w:p>
+      <w:r>
+        <w:t>A cross-analysis between the sent-status marker (synced) on the smartwatch and the presence of records on the smartphone revealed an important finding. A total of 2,879 readings were marked as sent (synced = 1) by the smartwatch but were not found in the smartphone database, whereas only the last 5 readings were genuinely still pending. All of this 2,879-record difference occurred during periods when the smartphone was disconnected. This indicates that, in the current implementation, the sent marking is applied at the notification-send level without being fully confirmed by an application-level ACK when the link is inactive, so the backlog accumulated during disconnection is not always retransmitted (backfilled) after the link recovers. Consequently, the store-and-forward mechanism preserves completeness well while the link is active but is not yet fully resilient to disconnect-reconnect scenarios. The recommended improvements are to defer the synced marking until an ACK is received and to add a backfill trigger that scans unconfirmed records whenever a connection is re-established. This finding reinforces the importance of application-level acknowledgement over relying on BLE notifications alone.</w:t>
+      </w:r>
+    </w:p>
+    <w:p>
       <w:pPr>
         <w:spacing w:before="200" w:after="80"/>
       </w:pPr>
@@ -1605,7 +2024,7 @@
           <w:i w:val="0"/>
           <w:sz w:val="22"/>
         </w:rPr>
-        <w:t>3.5 Discussion and Limitations</w:t>
+        <w:t>3.6 Discussion and Limitations</w:t>
       </w:r>
     </w:p>
     <w:p>
@@ -1620,7 +2039,7 @@
           <w:i w:val="0"/>
           <w:sz w:val="22"/>
         </w:rPr>
-        <w:t>The results show that the combination of store-and-forward, ACK, and an idempotent receiver can preserve data completeness and integrity under normal conditions, while opcode-based framing with flow control overcomes the BLE notification size limit. Time-based matching makes the delivery computation independent of clock synchronization.</w:t>
+        <w:t>The results show that the combination of store-and-forward, ACK, and an idempotent receiver can preserve data completeness and integrity while the BLE link is active—evidenced by 100% value fidelity and near-zero loss when connected—while opcode-based framing with flow control overcomes the BLE notification size limit. Time-based matching makes the delivery computation independent of clock synchronization. Conversely, as discussed in Section 3.5, reliability degrades in disconnect scenarios, so backlog backfill needs to be strengthened.</w:t>
       </w:r>
     </w:p>
     <w:p>
@@ -1635,7 +2054,7 @@
           <w:i w:val="0"/>
           <w:sz w:val="22"/>
         </w:rPr>
-        <w:t>This study has several limitations. First, the evaluation is still based on a single session, so replication and varied conditions are needed to obtain representative means and standard deviations. Second, background execution covers the application being in the background and the screen off, but does not yet guarantee operation when the application is force-closed or after a device reboot, which is also constrained by OS power-saving policies. Third, the BLE communication does not yet apply encryption/authentication, so the security of health data is a development agenda. Fourth, the sensor on a consumer smartwatch is not clinically validated, so the contribution focuses on communication reliability rather than the medical accuracy of the heart-rate values.</w:t>
+        <w:t>This study has several limitations. First, the evaluation spans four sessions on a single device pair and a single environment, so replication across devices, distances, and interference conditions is needed to obtain representative means and standard deviations. Second, it was found that the backlog during disconnection is not always backfilled (Section 3.5); strengthening the ACK and backfill trigger is a priority improvement. Third, background execution covers the application being in the background and the screen off, but does not yet guarantee operation when the application is force-closed or after a device reboot, which is also constrained by OS power-saving policies. Fourth, the BLE communication does not yet apply encryption/authentication, so the security of health data is a development agenda. Fifth, the sensor on a consumer smartwatch is not clinically validated, so the contribution focuses on communication reliability rather than the medical accuracy of the heart-rate values.</w:t>
       </w:r>
     </w:p>
     <w:p>
@@ -1664,7 +2083,7 @@
           <w:i w:val="0"/>
           <w:sz w:val="22"/>
         </w:rPr>
-        <w:t>This study designed and implemented a BLE-based heart-rate data delivery system from a smartwatch to a smartphone using batch framing, store-and-forward, delivery acknowledgement (ACK), an idempotent receiver, and background execution. Testing on physical devices showed a 99.86% delivery ratio with no duplicates in a single ~36-minute session, with 99.1% of data at the highest accuracy, and fast batch transfer (~0.32 s for 228 readings at MTU 512). Future work includes formal measurement across varied conditions with replication, strengthening background execution (including auto-start after reboot), and adding encryption for data security.</w:t>
+        <w:t>This study designed and implemented a BLE-based heart-rate data delivery system from a smartwatch to a smartphone using batch framing, store-and-forward, delivery acknowledgement (ACK), an idempotent receiver, and background execution. Testing on physical devices across four sessions (23,215 readings in total) showed high data integrity—100% value fidelity and near-zero loss while the BLE link was active—with 90.8% of data at the highest accuracy and fast batch transfer (~0.32 s for 228 readings at MTU 512). The evaluation also revealed a limitation: during disconnection periods the backlog was not always backfilled, so the aggregate delivery ratio was 88.1%. Future work includes strengthening the backfill and ACK mechanisms for disconnect-reconnect resilience, formal measurement across varied conditions with replication, strengthening background execution (including auto-start after reboot), and adding encryption for data security.</w:t>
       </w:r>
     </w:p>
     <w:p>

</xml_diff>

<commit_message>
docs: hapus judul ter-embed pada figur fig_hr_* dan segarkan gambar di naskah & catatan
- fig_hr_* (PNG/PDF) tanpa judul/subjudul; area plot diperbesar
- ganti gambar ter-embed (rasio dijaga) di naskah ID & EN serta catatan 28 Jun (+ sederhana)
</commit_message>
<xml_diff>
--- a/Draft_Manuscript_HR_BLE_EN.docx
+++ b/Draft_Manuscript_HR_BLE_EN.docx
@@ -1547,7 +1547,7 @@
       <w:r>
         <w:drawing>
           <wp:inline xmlns:a="http://schemas.openxmlformats.org/drawingml/2006/main" xmlns:pic="http://schemas.openxmlformats.org/drawingml/2006/picture">
-            <wp:extent cx="5120640" cy="2343955"/>
+            <wp:extent cx="5120640" cy="2331935"/>
             <wp:docPr id="6" name="Picture 6"/>
             <wp:cNvGraphicFramePr>
               <a:graphicFrameLocks noChangeAspect="1"/>
@@ -1568,7 +1568,7 @@
                   <pic:spPr>
                     <a:xfrm>
                       <a:off x="0" y="0"/>
-                      <a:ext cx="5120640" cy="2343955"/>
+                      <a:ext cx="5120640" cy="2331935"/>
                     </a:xfrm>
                     <a:prstGeom prst="rect"/>
                   </pic:spPr>
@@ -1597,7 +1597,7 @@
       <w:r>
         <w:drawing>
           <wp:inline xmlns:a="http://schemas.openxmlformats.org/drawingml/2006/main" xmlns:pic="http://schemas.openxmlformats.org/drawingml/2006/picture">
-            <wp:extent cx="5760720" cy="2936523"/>
+            <wp:extent cx="5760720" cy="2895260"/>
             <wp:docPr id="7" name="Picture 7"/>
             <wp:cNvGraphicFramePr>
               <a:graphicFrameLocks noChangeAspect="1"/>
@@ -1618,7 +1618,7 @@
                   <pic:spPr>
                     <a:xfrm>
                       <a:off x="0" y="0"/>
-                      <a:ext cx="5760720" cy="2936523"/>
+                      <a:ext cx="5760720" cy="2895260"/>
                     </a:xfrm>
                     <a:prstGeom prst="rect"/>
                   </pic:spPr>
@@ -1877,7 +1877,7 @@
       <w:r>
         <w:drawing>
           <wp:inline xmlns:a="http://schemas.openxmlformats.org/drawingml/2006/main" xmlns:pic="http://schemas.openxmlformats.org/drawingml/2006/picture">
-            <wp:extent cx="4297680" cy="2840726"/>
+            <wp:extent cx="4297680" cy="2827421"/>
             <wp:docPr id="8" name="Picture 8"/>
             <wp:cNvGraphicFramePr>
               <a:graphicFrameLocks noChangeAspect="1"/>
@@ -1898,7 +1898,7 @@
                   <pic:spPr>
                     <a:xfrm>
                       <a:off x="0" y="0"/>
-                      <a:ext cx="4297680" cy="2840726"/>
+                      <a:ext cx="4297680" cy="2827421"/>
                     </a:xfrm>
                     <a:prstGeom prst="rect"/>
                   </pic:spPr>
@@ -1927,7 +1927,7 @@
       <w:r>
         <w:drawing>
           <wp:inline xmlns:a="http://schemas.openxmlformats.org/drawingml/2006/main" xmlns:pic="http://schemas.openxmlformats.org/drawingml/2006/picture">
-            <wp:extent cx="4572000" cy="2942410"/>
+            <wp:extent cx="4572000" cy="2719016"/>
             <wp:docPr id="9" name="Picture 9"/>
             <wp:cNvGraphicFramePr>
               <a:graphicFrameLocks noChangeAspect="1"/>
@@ -1948,7 +1948,7 @@
                   <pic:spPr>
                     <a:xfrm>
                       <a:off x="0" y="0"/>
-                      <a:ext cx="4572000" cy="2942410"/>
+                      <a:ext cx="4572000" cy="2719016"/>
                     </a:xfrm>
                     <a:prstGeom prst="rect"/>
                   </pic:spPr>

</xml_diff>